<commit_message>
20/7 UAT Setup Manual
</commit_message>
<xml_diff>
--- a/docs/UAT_VM_Setup_and_Operations_Guide.docx
+++ b/docs/UAT_VM_Setup_and_Operations_Guide.docx
@@ -99,7 +99,7 @@
         <w:jc w:val="center"/>
       </w:pPr>
       <w:r>
-        <w:t>15 July 2026 | UAT status: web path, database correction, functional validation, and daily database backup setup completed</w:t>
+        <w:t>17 July 2026 | UAT status: web path, corrected UAT database, functional validation, daily database backups, and loopback database connection performance configuration completed</w:t>
       </w:r>
     </w:p>
     <w:p>
@@ -134,7 +134,7 @@
         <w:ind w:left="173" w:right="173"/>
       </w:pPr>
       <w:r>
-        <w:t>Current status: The IIS, Waitress, and tester network path were validated; a TCP test from a tester PC to the UAT public IP on port 80 returned True. The .env database settings use ticketdata_uat and ticket_uat, local PostgreSQL access for ticket_uat was restored, and Django migrations were applied to the correct UAT database. The UAT superuser, demo fixture, static files, service restart, local/tester browser checks, populated manual backup, and daily PostgreSQL 18 backup task have all been completed and verified. HTTPS, SMTP, backup-restore testing, media backup, and tighter access restrictions remain later hardening work.</w:t>
+        <w:t>Current status: The IIS, Waitress, and tester network path were validated; a TCP test from a tester PC to the UAT public IP on port 80 returned True. The .env database settings use ticketdata_uat and ticket_uat, local PostgreSQL access for ticket_uat was restored, and Django migrations were applied to the correct UAT database. The UAT superuser, demo fixture, static files, service restart, local/tester browser checks, populated manual backup, and daily PostgreSQL 18 backup task have all been completed and verified. On 17 July 2026, UAT also enabled 60-second Django database connection reuse and disabled PostgreSQL TLS negotiation only for the VM-local loopback connection. Local IIS requests then stabilized at 51-58 ms after one warm-up request. A tester-led authenticated workflow performance pass remains in progress. HTTPS, SMTP, backup-restore testing, media backup, and tighter access restrictions remain later hardening work.</w:t>
       </w:r>
     </w:p>
     <w:p>
@@ -1949,6 +1949,112 @@
           </w:p>
         </w:tc>
       </w:tr>
+      <w:tr>
+        <w:tc>
+          <w:tcPr>
+            <w:tcW w:type="dxa" w:w="2250"/>
+            <w:tcMar>
+              <w:top w:w="80" w:type="dxa"/>
+              <w:start w:w="120" w:type="dxa"/>
+              <w:bottom w:w="80" w:type="dxa"/>
+              <w:end w:w="120" w:type="dxa"/>
+            </w:tcMar>
+            <w:vAlign w:val="center"/>
+          </w:tcPr>
+          <w:p>
+            <w:r>
+              <w:t>Database connection configuration</w:t>
+            </w:r>
+          </w:p>
+        </w:tc>
+        <w:tc>
+          <w:tcPr>
+            <w:tcW w:type="dxa" w:w="2440"/>
+            <w:tcMar>
+              <w:top w:w="80" w:type="dxa"/>
+              <w:start w:w="120" w:type="dxa"/>
+              <w:bottom w:w="80" w:type="dxa"/>
+              <w:end w:w="120" w:type="dxa"/>
+            </w:tcMar>
+            <w:vAlign w:val="center"/>
+          </w:tcPr>
+          <w:p>
+            <w:r>
+              <w:t>Confirmed</w:t>
+            </w:r>
+          </w:p>
+        </w:tc>
+        <w:tc>
+          <w:tcPr>
+            <w:tcW w:type="dxa" w:w="4670"/>
+            <w:tcMar>
+              <w:top w:w="80" w:type="dxa"/>
+              <w:start w:w="120" w:type="dxa"/>
+              <w:bottom w:w="80" w:type="dxa"/>
+              <w:end w:w="120" w:type="dxa"/>
+            </w:tcMar>
+            <w:vAlign w:val="center"/>
+          </w:tcPr>
+          <w:p>
+            <w:r>
+              <w:t>Django reported loopback host, 60-second connection reuse, health checks enabled, and sslmode=disable.</w:t>
+            </w:r>
+          </w:p>
+        </w:tc>
+      </w:tr>
+      <w:tr>
+        <w:tc>
+          <w:tcPr>
+            <w:tcW w:type="dxa" w:w="2250"/>
+            <w:tcMar>
+              <w:top w:w="80" w:type="dxa"/>
+              <w:start w:w="120" w:type="dxa"/>
+              <w:bottom w:w="80" w:type="dxa"/>
+              <w:end w:w="120" w:type="dxa"/>
+            </w:tcMar>
+            <w:vAlign w:val="center"/>
+          </w:tcPr>
+          <w:p>
+            <w:r>
+              <w:t>IIS warm-request timing</w:t>
+            </w:r>
+          </w:p>
+        </w:tc>
+        <w:tc>
+          <w:tcPr>
+            <w:tcW w:type="dxa" w:w="2440"/>
+            <w:tcMar>
+              <w:top w:w="80" w:type="dxa"/>
+              <w:start w:w="120" w:type="dxa"/>
+              <w:bottom w:w="80" w:type="dxa"/>
+              <w:end w:w="120" w:type="dxa"/>
+            </w:tcMar>
+            <w:vAlign w:val="center"/>
+          </w:tcPr>
+          <w:p>
+            <w:r>
+              <w:t>51-58 ms</w:t>
+            </w:r>
+          </w:p>
+        </w:tc>
+        <w:tc>
+          <w:tcPr>
+            <w:tcW w:type="dxa" w:w="4670"/>
+            <w:tcMar>
+              <w:top w:w="80" w:type="dxa"/>
+              <w:start w:w="120" w:type="dxa"/>
+              <w:bottom w:w="80" w:type="dxa"/>
+              <w:end w:w="120" w:type="dxa"/>
+            </w:tcMar>
+            <w:vAlign w:val="center"/>
+          </w:tcPr>
+          <w:p>
+            <w:r>
+              <w:t>Requests 2-10 to the local IIS login endpoint were stable after a 496 ms initial warm-up request.</w:t>
+            </w:r>
+          </w:p>
+        </w:tc>
+      </w:tr>
     </w:tbl>
     <w:p>
       <w:pPr>
@@ -2318,6 +2424,62 @@
     <w:p>
       <w:pPr>
         <w:pStyle w:val="Heading2"/>
+        <w:shd w:fill="F2F4F7" w:val="clear"/>
+      </w:pPr>
+      <w:r>
+        <w:t>Database connection performance configuration (17 July 2026)</w:t>
+      </w:r>
+    </w:p>
+    <w:p>
+      <w:pPr>
+        <w:shd w:fill="F2F4F7" w:val="clear"/>
+      </w:pPr>
+      <w:r>
+        <w:t>Performance investigation separated database query speed from connection startup. Once connected, SELECT 1 completed in less than 1 ms, but new connections previously took 18.8-28.5 seconds through Django. A direct PostgreSQL connection with SSL disabled took about 4.66 seconds, while SSL preferred timed out. This pointed to connection/TLS negotiation and VM-wide process-start overhead rather than slow SQL execution.</w:t>
+      </w:r>
+    </w:p>
+    <w:p>
+      <w:pPr>
+        <w:shd w:fill="F2F4F7" w:val="clear"/>
+      </w:pPr>
+      <w:r>
+        <w:t>Commit 9f750e4 added configurable Django connection reuse, connection health checks, and PostgreSQL sslmode. The UAT .env now uses the following values. These settings apply only because PostgreSQL is on the same VM and TCP 5432 remains closed to tester and public networks.</w:t>
+      </w:r>
+    </w:p>
+    <w:p>
+      <w:pPr>
+        <w:pStyle w:val="Code"/>
+        <w:shd w:fill="F2F4F7" w:val="clear"/>
+      </w:pPr>
+      <w:r>
+        <w:t>DB_HOST=127.0.0.1</w:t>
+        <w:br/>
+        <w:t>DB_PORT=5432</w:t>
+        <w:br/>
+        <w:t>DB_CONN_MAX_AGE=60</w:t>
+        <w:br/>
+        <w:t>DB_SSLMODE=disable</w:t>
+      </w:r>
+    </w:p>
+    <w:p>
+      <w:pPr>
+        <w:shd w:fill="F2F4F7" w:val="clear"/>
+      </w:pPr>
+      <w:r>
+        <w:t>Django confirmed HOST=127.0.0.1, PORT=5432, CONN_MAX_AGE=60, CONN_HEALTH_CHECKS=True, and sslmode=disable after the scheduled task was restarted. A local IIS test recorded 496 ms for the first warm-up request and 51-58 ms for requests 2-10. If PostgreSQL is ever moved off this VM, review this setting and require properly validated TLS instead of carrying DB_SSLMODE=disable to a network connection.</w:t>
+      </w:r>
+    </w:p>
+    <w:p>
+      <w:pPr>
+        <w:shd w:fill="F2F4F7" w:val="clear"/>
+      </w:pPr>
+      <w:r>
+        <w:t>VM counters collected during the investigation did not show CPU, memory, or disk saturation: CPU utilization was low, about 4.2 GB of memory remained available, and observed disk latency was below about 1.2 ms. The installed 8 GB of RAM was therefore not identified as the primary cause. If PowerShell and general process startup remain slow, investigate endpoint-security scan overhead, cloud-host scheduling, and RDP/network latency separately; do not disable Trellix/McAfee without administrator approval.</w:t>
+      </w:r>
+    </w:p>
+    <w:p>
+      <w:pPr>
+        <w:pStyle w:val="Heading2"/>
       </w:pPr>
       <w:r>
         <w:t>Back up the UAT PostgreSQL database</w:t>
@@ -2385,12 +2547,7 @@
     <w:p>
       <w:pPr/>
       <w:r>
-        <w:rPr>
-          <w:rFonts w:ascii="Calibri" w:hAnsi="Calibri"/>
-          <w:color w:val="000000"/>
-          <w:sz w:val="22"/>
-        </w:rPr>
-        <w:t>Only deploy a reviewed commit that UAT is meant to evaluate. Record the current Git commit before changing it, back up UAT data once backup automation exists, then update dependencies and database schema before restarting the scheduled task.</w:t>
+        <w:t>UAT does not update automatically when a commit is pushed. Deployment is manual. Only deploy a reviewed commit that UAT is meant to evaluate. Record the current Git commit before changing it, confirm the working tree contains no unexpected application-code edits, back up UAT data, then update dependencies and database schema before restarting the scheduled task.</w:t>
       </w:r>
     </w:p>
     <w:p>
@@ -2399,83 +2556,26 @@
         <w:shd w:fill="F2F4F7" w:val="clear"/>
       </w:pPr>
       <w:r>
-        <w:rPr>
-          <w:rFonts w:ascii="Consolas" w:hAnsi="Consolas"/>
-          <w:color w:val="0B2545"/>
-          <w:sz w:val="18"/>
-        </w:rPr>
         <w:t>cd C:\Projects\SOC_Ticket</w:t>
         <w:br/>
-      </w:r>
-      <w:r>
-        <w:rPr>
-          <w:rFonts w:ascii="Consolas" w:hAnsi="Consolas"/>
-          <w:color w:val="0B2545"/>
-          <w:sz w:val="18"/>
-        </w:rPr>
+        <w:t>git status --short</w:t>
+        <w:br/>
         <w:t>git rev-parse --short HEAD</w:t>
         <w:br/>
-      </w:r>
-      <w:r>
-        <w:rPr>
-          <w:rFonts w:ascii="Consolas" w:hAnsi="Consolas"/>
-          <w:color w:val="0B2545"/>
-          <w:sz w:val="18"/>
-        </w:rPr>
-        <w:t>git pull</w:t>
+        <w:t>git pull --ff-only</w:t>
         <w:br/>
-      </w:r>
-      <w:r>
-        <w:rPr>
-          <w:rFonts w:ascii="Consolas" w:hAnsi="Consolas"/>
-          <w:color w:val="0B2545"/>
-          <w:sz w:val="18"/>
-        </w:rPr>
         <w:t>.\.venv\Scripts\Activate.ps1</w:t>
         <w:br/>
-      </w:r>
-      <w:r>
-        <w:rPr>
-          <w:rFonts w:ascii="Consolas" w:hAnsi="Consolas"/>
-          <w:color w:val="0B2545"/>
-          <w:sz w:val="18"/>
-        </w:rPr>
         <w:t>pip install -r requirements.txt</w:t>
         <w:br/>
-      </w:r>
-      <w:r>
-        <w:rPr>
-          <w:rFonts w:ascii="Consolas" w:hAnsi="Consolas"/>
-          <w:color w:val="0B2545"/>
-          <w:sz w:val="18"/>
-        </w:rPr>
+        <w:t>python manage.py check</w:t>
+        <w:br/>
         <w:t>python manage.py migrate</w:t>
         <w:br/>
-      </w:r>
-      <w:r>
-        <w:rPr>
-          <w:rFonts w:ascii="Consolas" w:hAnsi="Consolas"/>
-          <w:color w:val="0B2545"/>
-          <w:sz w:val="18"/>
-        </w:rPr>
         <w:t>python manage.py collectstatic --noinput</w:t>
         <w:br/>
-      </w:r>
-      <w:r>
-        <w:rPr>
-          <w:rFonts w:ascii="Consolas" w:hAnsi="Consolas"/>
-          <w:color w:val="0B2545"/>
-          <w:sz w:val="18"/>
-        </w:rPr>
         <w:t>schtasks /End /TN "SOC Ticket UAT"</w:t>
         <w:br/>
-      </w:r>
-      <w:r>
-        <w:rPr>
-          <w:rFonts w:ascii="Consolas" w:hAnsi="Consolas"/>
-          <w:color w:val="0B2545"/>
-          <w:sz w:val="18"/>
-        </w:rPr>
         <w:t>schtasks /Run /TN "SOC Ticket UAT"</w:t>
       </w:r>
     </w:p>
@@ -2486,21 +2586,17 @@
         <w:ind w:left="173" w:right="173"/>
       </w:pPr>
       <w:r>
-        <w:rPr>
-          <w:rFonts w:ascii="Calibri" w:hAnsi="Calibri"/>
-          <w:b/>
-          <w:color w:val="7A5A00"/>
-          <w:sz w:val="21"/>
-        </w:rPr>
-        <w:t xml:space="preserve">Change-control note: </w:t>
+        <w:t>Change-control note: Do not normally edit application code directly in the UAT folder. Make changes in Development, test and commit them, then deploy the selected commit to UAT. Exception record: during the 17 July 2026 connection investigation, the staged configuration-only diff was verified on UAT and committed as 9f750e4 before being pushed to main. The Development PC must pull main before further development so both copies share that history.</w:t>
       </w:r>
+    </w:p>
+    <w:p>
+      <w:pPr>
+        <w:shd w:fill="FFF7E1" w:val="clear"/>
+        <w:spacing w:before="40" w:after="40"/>
+        <w:ind w:left="173" w:right="173"/>
+      </w:pPr>
       <w:r>
-        <w:rPr>
-          <w:rFonts w:ascii="Calibri" w:hAnsi="Calibri"/>
-          <w:color w:val="000000"/>
-          <w:sz w:val="21"/>
-        </w:rPr>
-        <w:t>Do not edit application code directly in the UAT folder. Make changes in Development, commit and review them, then deploy the selected commit to UAT.</w:t>
+        <w:t>Run the full Django test suite on Development or CI, not against the UAT runtime role. The ticket_uat PostgreSQL role intentionally does not have CREATEDB; therefore, python manage.py test on UAT can report permission denied while creating the test database. Do not grant CREATEDB merely to make UAT tests run. python manage.py check, migrations, and controlled browser smoke tests are the appropriate UAT deployment checks.</w:t>
       </w:r>
     </w:p>
     <w:p>
@@ -2951,6 +3047,17 @@
         </w:numPr>
       </w:pPr>
       <w:r>
+        <w:t>The core role and ticket-flow UAT can continue using the bundled Wazuh fixture; a live Wazuh API connection is not required for basic acceptance testing. Connect UAT to Wazuh only for a separately approved integration test, using a dedicated least-privilege read-only API account, an explicit network allowlist, and no Production administrator credentials. Keep the fixture-only configuration until that integration scope is approved.</w:t>
+      </w:r>
+    </w:p>
+    <w:p>
+      <w:pPr>
+        <w:numPr>
+          <w:ilvl w:val="0"/>
+          <w:numId w:val="13"/>
+        </w:numPr>
+      </w:pPr>
+      <w:r>
         <w:rPr>
           <w:rFonts w:ascii="Calibri" w:hAnsi="Calibri"/>
           <w:color w:val="000000"/>
@@ -3010,7 +3117,7 @@
         </w:numPr>
       </w:pPr>
       <w:r>
-        <w:t>Run a controlled UAT test cycle with representative users, record each finding as a defect, configuration request, or enhancement requirement, and document the approval result. Production must deploy the exact approved commit, not a later untested change.</w:t>
+        <w:t>Run a controlled UAT test cycle with representative users, record each finding as a defect, configuration request, or enhancement requirement, and document the approval result. For performance revalidation, have testers run the dashboard, ticket list, ticket detail, edit/save, create-ticket, and return-to-dashboard sequence twice, recording first-pass and second-pass response times. Production must deploy the exact approved commit, not a later untested change.</w:t>
       </w:r>
     </w:p>
     <w:p>

</xml_diff>